<commit_message>
update - continue without the html
</commit_message>
<xml_diff>
--- a/task-4/Task4_Automation_Design.docx
+++ b/task-4/Task4_Automation_Design.docx
@@ -365,7 +365,7 @@
                 <w:sz w:val="19"/>
                 <w:szCs w:val="19"/>
               </w:rPr>
-              <w:t xml:space="preserve"> was not included in the pack I received; I have asked for it. Tab and field names below are examples based on the brief. If the real page differs, only the field list changes.</w:t>
+              <w:t xml:space="preserve"> was not included in the pack I received. As confirmed by the recruitment team, this design is based on the written description in the brief. Tab and field names below are examples; if the real page differs, only the field list changes.</w:t>
             </w:r>
           </w:p>
         </w:tc>
@@ -1738,7 +1738,7 @@
         <w:t xml:space="preserve">.config-item</w:t>
       </w:r>
       <w:r>
-        <w:t xml:space="preserve"> stands for the wrapper’s real class or attribute, which I would confirm on the reference page. </w:t>
+        <w:t xml:space="preserve"> stands for the wrapper’s real class or attribute, which I would confirm on the real console. </w:t>
       </w:r>
       <w:r>
         <w:rPr>

</xml_diff>